<commit_message>
docs: add high-resolution UI screenshots gallery and update comprehensive report
</commit_message>
<xml_diff>
--- a/FuelMate_2.0_Comprehensive_Documentation.docx
+++ b/FuelMate_2.0_Comprehensive_Documentation.docx
@@ -4017,7 +4017,668 @@
           <w:color w:val="008080"/>
           <w:sz w:val="26"/>
         </w:rPr>
-        <w:t>2.2 Localization &amp; Sri Lankan Automotive Ecosystem Standards</w:t>
+        <w:t>2.2 Visual User Interface Gallery</w:t>
+      </w:r>
+    </w:p>
+    <w:p>
+      <w:pPr>
+        <w:spacing w:before="0" w:after="120" w:line="276" w:lineRule="auto"/>
+      </w:pPr>
+      <w:r>
+        <w:rPr>
+          <w:rFonts w:ascii="Arial" w:hAnsi="Arial"/>
+          <w:color w:val="2D3748"/>
+          <w:sz w:val="20"/>
+        </w:rPr>
+        <w:t>The following figures showcase the production iOS user interface captured directly from FuelMate 2.0 running on iOS 17.2+, demonstrating the responsive dark theme, multi-vehicle management, dual City/Highway baseline benchmarking, Sri Lankan fuel grades, and Swift Charts visual telemetry:</w:t>
+      </w:r>
+    </w:p>
+    <w:tbl>
+      <w:tblPr>
+        <w:tblW w:type="auto" w:w="0"/>
+        <w:jc w:val="center"/>
+        <w:tblLook w:firstColumn="1" w:firstRow="1" w:lastColumn="0" w:lastRow="0" w:noHBand="0" w:noVBand="1" w:val="04A0"/>
+      </w:tblPr>
+      <w:tblGrid>
+        <w:gridCol w:w="3120"/>
+        <w:gridCol w:w="3120"/>
+        <w:gridCol w:w="3120"/>
+      </w:tblGrid>
+      <w:tr>
+        <w:tc>
+          <w:tcPr>
+            <w:tcW w:type="dxa" w:w="3120"/>
+          </w:tcPr>
+          <w:p>
+            <w:pPr>
+              <w:spacing w:before="80" w:after="40"/>
+              <w:jc w:val="center"/>
+            </w:pPr>
+            <w:r>
+              <w:drawing>
+                <wp:inline xmlns:a="http://schemas.openxmlformats.org/drawingml/2006/main" xmlns:pic="http://schemas.openxmlformats.org/drawingml/2006/picture">
+                  <wp:extent cx="1783080" cy="3855309"/>
+                  <wp:docPr id="1" name="Picture 1"/>
+                  <wp:cNvGraphicFramePr>
+                    <a:graphicFrameLocks noChangeAspect="1"/>
+                  </wp:cNvGraphicFramePr>
+                  <a:graphic>
+                    <a:graphicData uri="http://schemas.openxmlformats.org/drawingml/2006/picture">
+                      <pic:pic>
+                        <pic:nvPicPr>
+                          <pic:cNvPr id="0" name="01_dashboard_view.jpg"/>
+                          <pic:cNvPicPr/>
+                        </pic:nvPicPr>
+                        <pic:blipFill>
+                          <a:blip r:embed="rId11"/>
+                          <a:stretch>
+                            <a:fillRect/>
+                          </a:stretch>
+                        </pic:blipFill>
+                        <pic:spPr>
+                          <a:xfrm>
+                            <a:off x="0" y="0"/>
+                            <a:ext cx="1783080" cy="3855309"/>
+                          </a:xfrm>
+                          <a:prstGeom prst="rect"/>
+                        </pic:spPr>
+                      </pic:pic>
+                    </a:graphicData>
+                  </a:graphic>
+                </wp:inline>
+              </w:drawing>
+            </w:r>
+          </w:p>
+        </w:tc>
+        <w:tc>
+          <w:tcPr>
+            <w:tcW w:type="dxa" w:w="3120"/>
+          </w:tcPr>
+          <w:p>
+            <w:pPr>
+              <w:spacing w:before="80" w:after="40"/>
+              <w:jc w:val="center"/>
+            </w:pPr>
+            <w:r>
+              <w:drawing>
+                <wp:inline xmlns:a="http://schemas.openxmlformats.org/drawingml/2006/main" xmlns:pic="http://schemas.openxmlformats.org/drawingml/2006/picture">
+                  <wp:extent cx="1783080" cy="3855309"/>
+                  <wp:docPr id="2" name="Picture 2"/>
+                  <wp:cNvGraphicFramePr>
+                    <a:graphicFrameLocks noChangeAspect="1"/>
+                  </wp:cNvGraphicFramePr>
+                  <a:graphic>
+                    <a:graphicData uri="http://schemas.openxmlformats.org/drawingml/2006/picture">
+                      <pic:pic>
+                        <pic:nvPicPr>
+                          <pic:cNvPr id="0" name="02_vehicle_management.jpg"/>
+                          <pic:cNvPicPr/>
+                        </pic:nvPicPr>
+                        <pic:blipFill>
+                          <a:blip r:embed="rId12"/>
+                          <a:stretch>
+                            <a:fillRect/>
+                          </a:stretch>
+                        </pic:blipFill>
+                        <pic:spPr>
+                          <a:xfrm>
+                            <a:off x="0" y="0"/>
+                            <a:ext cx="1783080" cy="3855309"/>
+                          </a:xfrm>
+                          <a:prstGeom prst="rect"/>
+                        </pic:spPr>
+                      </pic:pic>
+                    </a:graphicData>
+                  </a:graphic>
+                </wp:inline>
+              </w:drawing>
+            </w:r>
+          </w:p>
+        </w:tc>
+        <w:tc>
+          <w:tcPr>
+            <w:tcW w:type="dxa" w:w="3120"/>
+          </w:tcPr>
+          <w:p>
+            <w:pPr>
+              <w:spacing w:before="80" w:after="40"/>
+              <w:jc w:val="center"/>
+            </w:pPr>
+            <w:r>
+              <w:drawing>
+                <wp:inline xmlns:a="http://schemas.openxmlformats.org/drawingml/2006/main" xmlns:pic="http://schemas.openxmlformats.org/drawingml/2006/picture">
+                  <wp:extent cx="1783080" cy="3855309"/>
+                  <wp:docPr id="3" name="Picture 3"/>
+                  <wp:cNvGraphicFramePr>
+                    <a:graphicFrameLocks noChangeAspect="1"/>
+                  </wp:cNvGraphicFramePr>
+                  <a:graphic>
+                    <a:graphicData uri="http://schemas.openxmlformats.org/drawingml/2006/picture">
+                      <pic:pic>
+                        <pic:nvPicPr>
+                          <pic:cNvPr id="0" name="03_add_vehicle_dual_baselines.jpg"/>
+                          <pic:cNvPicPr/>
+                        </pic:nvPicPr>
+                        <pic:blipFill>
+                          <a:blip r:embed="rId13"/>
+                          <a:stretch>
+                            <a:fillRect/>
+                          </a:stretch>
+                        </pic:blipFill>
+                        <pic:spPr>
+                          <a:xfrm>
+                            <a:off x="0" y="0"/>
+                            <a:ext cx="1783080" cy="3855309"/>
+                          </a:xfrm>
+                          <a:prstGeom prst="rect"/>
+                        </pic:spPr>
+                      </pic:pic>
+                    </a:graphicData>
+                  </a:graphic>
+                </wp:inline>
+              </w:drawing>
+            </w:r>
+          </w:p>
+        </w:tc>
+      </w:tr>
+      <w:tr>
+        <w:tc>
+          <w:tcPr>
+            <w:tcW w:type="dxa" w:w="3120"/>
+          </w:tcPr>
+          <w:p>
+            <w:pPr>
+              <w:spacing w:before="40" w:after="160"/>
+              <w:jc w:val="center"/>
+            </w:pPr>
+            <w:r>
+              <w:rPr>
+                <w:rFonts w:ascii="Arial" w:hAnsi="Arial"/>
+                <w:i/>
+                <w:color w:val="718096"/>
+                <w:sz w:val="16"/>
+              </w:rPr>
+              <w:t>Figure 2.1: Executive Dashboard &amp; KPI Grid</w:t>
+            </w:r>
+          </w:p>
+        </w:tc>
+        <w:tc>
+          <w:tcPr>
+            <w:tcW w:type="dxa" w:w="3120"/>
+          </w:tcPr>
+          <w:p>
+            <w:pPr>
+              <w:spacing w:before="40" w:after="160"/>
+              <w:jc w:val="center"/>
+            </w:pPr>
+            <w:r>
+              <w:rPr>
+                <w:rFonts w:ascii="Arial" w:hAnsi="Arial"/>
+                <w:i/>
+                <w:color w:val="718096"/>
+                <w:sz w:val="16"/>
+              </w:rPr>
+              <w:t>Figure 2.2: Multi-Vehicle Fleet Switcher</w:t>
+            </w:r>
+          </w:p>
+        </w:tc>
+        <w:tc>
+          <w:tcPr>
+            <w:tcW w:type="dxa" w:w="3120"/>
+          </w:tcPr>
+          <w:p>
+            <w:pPr>
+              <w:spacing w:before="40" w:after="160"/>
+              <w:jc w:val="center"/>
+            </w:pPr>
+            <w:r>
+              <w:rPr>
+                <w:rFonts w:ascii="Arial" w:hAnsi="Arial"/>
+                <w:i/>
+                <w:color w:val="718096"/>
+                <w:sz w:val="16"/>
+              </w:rPr>
+              <w:t>Figure 2.3: Dual Baseline Targets Setup</w:t>
+            </w:r>
+          </w:p>
+        </w:tc>
+      </w:tr>
+    </w:tbl>
+    <w:tbl>
+      <w:tblPr>
+        <w:tblW w:type="auto" w:w="0"/>
+        <w:jc w:val="center"/>
+        <w:tblLook w:firstColumn="1" w:firstRow="1" w:lastColumn="0" w:lastRow="0" w:noHBand="0" w:noVBand="1" w:val="04A0"/>
+      </w:tblPr>
+      <w:tblGrid>
+        <w:gridCol w:w="3120"/>
+        <w:gridCol w:w="3120"/>
+        <w:gridCol w:w="3120"/>
+      </w:tblGrid>
+      <w:tr>
+        <w:tc>
+          <w:tcPr>
+            <w:tcW w:type="dxa" w:w="3120"/>
+          </w:tcPr>
+          <w:p>
+            <w:pPr>
+              <w:spacing w:before="80" w:after="40"/>
+              <w:jc w:val="center"/>
+            </w:pPr>
+            <w:r>
+              <w:drawing>
+                <wp:inline xmlns:a="http://schemas.openxmlformats.org/drawingml/2006/main" xmlns:pic="http://schemas.openxmlformats.org/drawingml/2006/picture">
+                  <wp:extent cx="1783080" cy="3855309"/>
+                  <wp:docPr id="4" name="Picture 4"/>
+                  <wp:cNvGraphicFramePr>
+                    <a:graphicFrameLocks noChangeAspect="1"/>
+                  </wp:cNvGraphicFramePr>
+                  <a:graphic>
+                    <a:graphicData uri="http://schemas.openxmlformats.org/drawingml/2006/picture">
+                      <pic:pic>
+                        <pic:nvPicPr>
+                          <pic:cNvPr id="0" name="04_log_fillup_form.jpg"/>
+                          <pic:cNvPicPr/>
+                        </pic:nvPicPr>
+                        <pic:blipFill>
+                          <a:blip r:embed="rId14"/>
+                          <a:stretch>
+                            <a:fillRect/>
+                          </a:stretch>
+                        </pic:blipFill>
+                        <pic:spPr>
+                          <a:xfrm>
+                            <a:off x="0" y="0"/>
+                            <a:ext cx="1783080" cy="3855309"/>
+                          </a:xfrm>
+                          <a:prstGeom prst="rect"/>
+                        </pic:spPr>
+                      </pic:pic>
+                    </a:graphicData>
+                  </a:graphic>
+                </wp:inline>
+              </w:drawing>
+            </w:r>
+          </w:p>
+        </w:tc>
+        <w:tc>
+          <w:tcPr>
+            <w:tcW w:type="dxa" w:w="3120"/>
+          </w:tcPr>
+          <w:p>
+            <w:pPr>
+              <w:spacing w:before="80" w:after="40"/>
+              <w:jc w:val="center"/>
+            </w:pPr>
+            <w:r>
+              <w:drawing>
+                <wp:inline xmlns:a="http://schemas.openxmlformats.org/drawingml/2006/main" xmlns:pic="http://schemas.openxmlformats.org/drawingml/2006/picture">
+                  <wp:extent cx="1783080" cy="3855309"/>
+                  <wp:docPr id="5" name="Picture 5"/>
+                  <wp:cNvGraphicFramePr>
+                    <a:graphicFrameLocks noChangeAspect="1"/>
+                  </wp:cNvGraphicFramePr>
+                  <a:graphic>
+                    <a:graphicData uri="http://schemas.openxmlformats.org/drawingml/2006/picture">
+                      <pic:pic>
+                        <pic:nvPicPr>
+                          <pic:cNvPr id="0" name="05_fuel_grades_dropdown.jpg"/>
+                          <pic:cNvPicPr/>
+                        </pic:nvPicPr>
+                        <pic:blipFill>
+                          <a:blip r:embed="rId15"/>
+                          <a:stretch>
+                            <a:fillRect/>
+                          </a:stretch>
+                        </pic:blipFill>
+                        <pic:spPr>
+                          <a:xfrm>
+                            <a:off x="0" y="0"/>
+                            <a:ext cx="1783080" cy="3855309"/>
+                          </a:xfrm>
+                          <a:prstGeom prst="rect"/>
+                        </pic:spPr>
+                      </pic:pic>
+                    </a:graphicData>
+                  </a:graphic>
+                </wp:inline>
+              </w:drawing>
+            </w:r>
+          </w:p>
+        </w:tc>
+        <w:tc>
+          <w:tcPr>
+            <w:tcW w:type="dxa" w:w="3120"/>
+          </w:tcPr>
+          <w:p>
+            <w:pPr>
+              <w:spacing w:before="80" w:after="40"/>
+              <w:jc w:val="center"/>
+            </w:pPr>
+            <w:r>
+              <w:drawing>
+                <wp:inline xmlns:a="http://schemas.openxmlformats.org/drawingml/2006/main" xmlns:pic="http://schemas.openxmlformats.org/drawingml/2006/picture">
+                  <wp:extent cx="1783080" cy="3855309"/>
+                  <wp:docPr id="6" name="Picture 6"/>
+                  <wp:cNvGraphicFramePr>
+                    <a:graphicFrameLocks noChangeAspect="1"/>
+                  </wp:cNvGraphicFramePr>
+                  <a:graphic>
+                    <a:graphicData uri="http://schemas.openxmlformats.org/drawingml/2006/picture">
+                      <pic:pic>
+                        <pic:nvPicPr>
+                          <pic:cNvPr id="0" name="06_fuel_history_logs.jpg"/>
+                          <pic:cNvPicPr/>
+                        </pic:nvPicPr>
+                        <pic:blipFill>
+                          <a:blip r:embed="rId16"/>
+                          <a:stretch>
+                            <a:fillRect/>
+                          </a:stretch>
+                        </pic:blipFill>
+                        <pic:spPr>
+                          <a:xfrm>
+                            <a:off x="0" y="0"/>
+                            <a:ext cx="1783080" cy="3855309"/>
+                          </a:xfrm>
+                          <a:prstGeom prst="rect"/>
+                        </pic:spPr>
+                      </pic:pic>
+                    </a:graphicData>
+                  </a:graphic>
+                </wp:inline>
+              </w:drawing>
+            </w:r>
+          </w:p>
+        </w:tc>
+      </w:tr>
+      <w:tr>
+        <w:tc>
+          <w:tcPr>
+            <w:tcW w:type="dxa" w:w="3120"/>
+          </w:tcPr>
+          <w:p>
+            <w:pPr>
+              <w:spacing w:before="40" w:after="160"/>
+              <w:jc w:val="center"/>
+            </w:pPr>
+            <w:r>
+              <w:rPr>
+                <w:rFonts w:ascii="Arial" w:hAnsi="Arial"/>
+                <w:i/>
+                <w:color w:val="718096"/>
+                <w:sz w:val="16"/>
+              </w:rPr>
+              <w:t>Figure 2.4: Smart Fill-Up Log Form</w:t>
+            </w:r>
+          </w:p>
+        </w:tc>
+        <w:tc>
+          <w:tcPr>
+            <w:tcW w:type="dxa" w:w="3120"/>
+          </w:tcPr>
+          <w:p>
+            <w:pPr>
+              <w:spacing w:before="40" w:after="160"/>
+              <w:jc w:val="center"/>
+            </w:pPr>
+            <w:r>
+              <w:rPr>
+                <w:rFonts w:ascii="Arial" w:hAnsi="Arial"/>
+                <w:i/>
+                <w:color w:val="718096"/>
+                <w:sz w:val="16"/>
+              </w:rPr>
+              <w:t>Figure 2.5: Sri Lankan Fuel Varieties</w:t>
+            </w:r>
+          </w:p>
+        </w:tc>
+        <w:tc>
+          <w:tcPr>
+            <w:tcW w:type="dxa" w:w="3120"/>
+          </w:tcPr>
+          <w:p>
+            <w:pPr>
+              <w:spacing w:before="40" w:after="160"/>
+              <w:jc w:val="center"/>
+            </w:pPr>
+            <w:r>
+              <w:rPr>
+                <w:rFonts w:ascii="Arial" w:hAnsi="Arial"/>
+                <w:i/>
+                <w:color w:val="718096"/>
+                <w:sz w:val="16"/>
+              </w:rPr>
+              <w:t>Figure 2.6: Chronological Fuel History</w:t>
+            </w:r>
+          </w:p>
+        </w:tc>
+      </w:tr>
+    </w:tbl>
+    <w:tbl>
+      <w:tblPr>
+        <w:tblW w:type="auto" w:w="0"/>
+        <w:jc w:val="center"/>
+        <w:tblLook w:firstColumn="1" w:firstRow="1" w:lastColumn="0" w:lastRow="0" w:noHBand="0" w:noVBand="1" w:val="04A0"/>
+      </w:tblPr>
+      <w:tblGrid>
+        <w:gridCol w:w="3120"/>
+        <w:gridCol w:w="3120"/>
+        <w:gridCol w:w="3120"/>
+      </w:tblGrid>
+      <w:tr>
+        <w:tc>
+          <w:tcPr>
+            <w:tcW w:type="dxa" w:w="3120"/>
+          </w:tcPr>
+          <w:p>
+            <w:pPr>
+              <w:spacing w:before="80" w:after="40"/>
+              <w:jc w:val="center"/>
+            </w:pPr>
+            <w:r>
+              <w:drawing>
+                <wp:inline xmlns:a="http://schemas.openxmlformats.org/drawingml/2006/main" xmlns:pic="http://schemas.openxmlformats.org/drawingml/2006/picture">
+                  <wp:extent cx="1783080" cy="3855309"/>
+                  <wp:docPr id="7" name="Picture 7"/>
+                  <wp:cNvGraphicFramePr>
+                    <a:graphicFrameLocks noChangeAspect="1"/>
+                  </wp:cNvGraphicFramePr>
+                  <a:graphic>
+                    <a:graphicData uri="http://schemas.openxmlformats.org/drawingml/2006/picture">
+                      <pic:pic>
+                        <pic:nvPicPr>
+                          <pic:cNvPr id="0" name="07_analytics_charts.jpg"/>
+                          <pic:cNvPicPr/>
+                        </pic:nvPicPr>
+                        <pic:blipFill>
+                          <a:blip r:embed="rId17"/>
+                          <a:stretch>
+                            <a:fillRect/>
+                          </a:stretch>
+                        </pic:blipFill>
+                        <pic:spPr>
+                          <a:xfrm>
+                            <a:off x="0" y="0"/>
+                            <a:ext cx="1783080" cy="3855309"/>
+                          </a:xfrm>
+                          <a:prstGeom prst="rect"/>
+                        </pic:spPr>
+                      </pic:pic>
+                    </a:graphicData>
+                  </a:graphic>
+                </wp:inline>
+              </w:drawing>
+            </w:r>
+          </w:p>
+        </w:tc>
+        <w:tc>
+          <w:tcPr>
+            <w:tcW w:type="dxa" w:w="3120"/>
+          </w:tcPr>
+          <w:p>
+            <w:pPr>
+              <w:spacing w:before="80" w:after="40"/>
+              <w:jc w:val="center"/>
+            </w:pPr>
+            <w:r>
+              <w:drawing>
+                <wp:inline xmlns:a="http://schemas.openxmlformats.org/drawingml/2006/main" xmlns:pic="http://schemas.openxmlformats.org/drawingml/2006/picture">
+                  <wp:extent cx="1783080" cy="3855309"/>
+                  <wp:docPr id="8" name="Picture 8"/>
+                  <wp:cNvGraphicFramePr>
+                    <a:graphicFrameLocks noChangeAspect="1"/>
+                  </wp:cNvGraphicFramePr>
+                  <a:graphic>
+                    <a:graphicData uri="http://schemas.openxmlformats.org/drawingml/2006/picture">
+                      <pic:pic>
+                        <pic:nvPicPr>
+                          <pic:cNvPr id="0" name="08_settings_fuel_prices.jpg"/>
+                          <pic:cNvPicPr/>
+                        </pic:nvPicPr>
+                        <pic:blipFill>
+                          <a:blip r:embed="rId18"/>
+                          <a:stretch>
+                            <a:fillRect/>
+                          </a:stretch>
+                        </pic:blipFill>
+                        <pic:spPr>
+                          <a:xfrm>
+                            <a:off x="0" y="0"/>
+                            <a:ext cx="1783080" cy="3855309"/>
+                          </a:xfrm>
+                          <a:prstGeom prst="rect"/>
+                        </pic:spPr>
+                      </pic:pic>
+                    </a:graphicData>
+                  </a:graphic>
+                </wp:inline>
+              </w:drawing>
+            </w:r>
+          </w:p>
+        </w:tc>
+        <w:tc>
+          <w:tcPr>
+            <w:tcW w:type="dxa" w:w="3120"/>
+          </w:tcPr>
+          <w:p>
+            <w:pPr>
+              <w:spacing w:before="80" w:after="40"/>
+              <w:jc w:val="center"/>
+            </w:pPr>
+            <w:r>
+              <w:drawing>
+                <wp:inline xmlns:a="http://schemas.openxmlformats.org/drawingml/2006/main" xmlns:pic="http://schemas.openxmlformats.org/drawingml/2006/picture">
+                  <wp:extent cx="1783080" cy="3855309"/>
+                  <wp:docPr id="9" name="Picture 9"/>
+                  <wp:cNvGraphicFramePr>
+                    <a:graphicFrameLocks noChangeAspect="1"/>
+                  </wp:cNvGraphicFramePr>
+                  <a:graphic>
+                    <a:graphicData uri="http://schemas.openxmlformats.org/drawingml/2006/picture">
+                      <pic:pic>
+                        <pic:nvPicPr>
+                          <pic:cNvPr id="0" name="09_settings_units_csv_export.jpg"/>
+                          <pic:cNvPicPr/>
+                        </pic:nvPicPr>
+                        <pic:blipFill>
+                          <a:blip r:embed="rId19"/>
+                          <a:stretch>
+                            <a:fillRect/>
+                          </a:stretch>
+                        </pic:blipFill>
+                        <pic:spPr>
+                          <a:xfrm>
+                            <a:off x="0" y="0"/>
+                            <a:ext cx="1783080" cy="3855309"/>
+                          </a:xfrm>
+                          <a:prstGeom prst="rect"/>
+                        </pic:spPr>
+                      </pic:pic>
+                    </a:graphicData>
+                  </a:graphic>
+                </wp:inline>
+              </w:drawing>
+            </w:r>
+          </w:p>
+        </w:tc>
+      </w:tr>
+      <w:tr>
+        <w:tc>
+          <w:tcPr>
+            <w:tcW w:type="dxa" w:w="3120"/>
+          </w:tcPr>
+          <w:p>
+            <w:pPr>
+              <w:spacing w:before="40" w:after="160"/>
+              <w:jc w:val="center"/>
+            </w:pPr>
+            <w:r>
+              <w:rPr>
+                <w:rFonts w:ascii="Arial" w:hAnsi="Arial"/>
+                <w:i/>
+                <w:color w:val="718096"/>
+                <w:sz w:val="16"/>
+              </w:rPr>
+              <w:t>Figure 2.7: Swift Charts Expense Breakdown</w:t>
+            </w:r>
+          </w:p>
+        </w:tc>
+        <w:tc>
+          <w:tcPr>
+            <w:tcW w:type="dxa" w:w="3120"/>
+          </w:tcPr>
+          <w:p>
+            <w:pPr>
+              <w:spacing w:before="40" w:after="160"/>
+              <w:jc w:val="center"/>
+            </w:pPr>
+            <w:r>
+              <w:rPr>
+                <w:rFonts w:ascii="Arial" w:hAnsi="Arial"/>
+                <w:i/>
+                <w:color w:val="718096"/>
+                <w:sz w:val="16"/>
+              </w:rPr>
+              <w:t>Figure 2.8: Editable Fuel Price Engine</w:t>
+            </w:r>
+          </w:p>
+        </w:tc>
+        <w:tc>
+          <w:tcPr>
+            <w:tcW w:type="dxa" w:w="3120"/>
+          </w:tcPr>
+          <w:p>
+            <w:pPr>
+              <w:spacing w:before="40" w:after="160"/>
+              <w:jc w:val="center"/>
+            </w:pPr>
+            <w:r>
+              <w:rPr>
+                <w:rFonts w:ascii="Arial" w:hAnsi="Arial"/>
+                <w:i/>
+                <w:color w:val="718096"/>
+                <w:sz w:val="16"/>
+              </w:rPr>
+              <w:t>Figure 2.9: RFC-4180 CSV Export &amp; Info</w:t>
+            </w:r>
+          </w:p>
+        </w:tc>
+      </w:tr>
+    </w:tbl>
+    <w:p>
+      <w:pPr>
+        <w:keepNext/>
+        <w:spacing w:before="280" w:after="120"/>
+      </w:pPr>
+      <w:r>
+        <w:rPr>
+          <w:rFonts w:ascii="Arial" w:hAnsi="Arial"/>
+          <w:b/>
+          <w:color w:val="008080"/>
+          <w:sz w:val="26"/>
+        </w:rPr>
+        <w:t>2.3 Localization &amp; Sri Lankan Automotive Ecosystem Standards</w:t>
       </w:r>
     </w:p>
     <w:p>

</xml_diff>

<commit_message>
style: replace all em dashes with hyphens across documentation and views
</commit_message>
<xml_diff>
--- a/FuelMate_2.0_Comprehensive_Documentation.docx
+++ b/FuelMate_2.0_Comprehensive_Documentation.docx
@@ -75,7 +75,7 @@
           <w:color w:val="2D3748"/>
           <w:sz w:val="20"/>
         </w:rPr>
-        <w:t>BSc (Hons) in Information Technology — Year 4</w:t>
+        <w:t>BSc (Hons) in Information Technology - Year 4</w:t>
         <w:br/>
       </w:r>
       <w:r>
@@ -113,7 +113,7 @@
           <w:color w:val="2D3748"/>
           <w:sz w:val="20"/>
         </w:rPr>
-        <w:t>Assignment 02 — Part A: Advanced iOS App (15%)</w:t>
+        <w:t>Assignment 02 - Part A: Advanced iOS App (15%)</w:t>
         <w:br/>
       </w:r>
       <w:r>
@@ -524,7 +524,7 @@
           <w:color w:val="2D3748"/>
           <w:sz w:val="19"/>
         </w:rPr>
-        <w:t>FuelMate 2.0 is a production-grade iOS vehicle expense, fuel economy, and fleet management application engineered using SwiftUI, Core Data, Apple's native Vision framework, Swift Charts, and MapKit. Built strictly to satisfy all core criteria and rubric dimensions of Part A (Advanced iOS Application — 15%), this document presents the end-to-end technical report, architectural blueprints, user documentation with high-resolution UI screenshots, rigorous test verification matrix, and transparent AI collaboration audit.</w:t>
+        <w:t>FuelMate 2.0 is a production-grade iOS vehicle expense, fuel economy, and fleet management application engineered using SwiftUI, Core Data, Apple's native Vision framework, Swift Charts, and MapKit. Built strictly to satisfy all core criteria and rubric dimensions of Part A (Advanced iOS Application - 15%), this document presents the end-to-end technical report, architectural blueprints, user documentation with high-resolution UI screenshots, rigorous test verification matrix, and transparent AI collaboration audit.</w:t>
       </w:r>
     </w:p>
     <w:p>
@@ -5311,7 +5311,7 @@
         <w:color w:val="718096"/>
         <w:sz w:val="17"/>
       </w:rPr>
-      <w:t>SE4041: Mobile Application Design &amp; Development  |  Assignment 2 — Part A (15%)</w:t>
+      <w:t>SE4041: Mobile Application Design &amp; Development  |  Assignment 2 - Part A (15%)</w:t>
     </w:r>
   </w:p>
 </w:ftr>
@@ -5330,7 +5330,7 @@
         <w:color w:val="718096"/>
         <w:sz w:val="17"/>
       </w:rPr>
-      <w:t>FuelMate 2.0 — Part A: Advanced iOS Application Technical Report</w:t>
+      <w:t>FuelMate 2.0 - Part A: Advanced iOS Application Technical Report</w:t>
     </w:r>
   </w:p>
 </w:hdr>

</xml_diff>